<commit_message>
One-pager: add explicit Pricing principles (NGOs never charged; value not seats) + market-competitiveness notes for Fund and Build
Co-Authored-By: Claude Opus 4.8 <noreply@anthropic.com>
</commit_message>
<xml_diff>
--- a/docs/Kuja_Pricing_One-Pager_2026-08-09.docx
+++ b/docs/Kuja_Pricing_One-Pager_2026-08-09.docx
@@ -1099,6 +1099,21 @@
     </w:tbl>
     <w:p>
       <w:pPr>
+        <w:spacing w:after="40" w:line="240" w:lineRule="auto"/>
+      </w:pPr>
+      <w:r>
+        <w:rPr>
+          <w:rFonts w:ascii="Georgia" w:hAnsi="Georgia"/>
+          <w:b w:val="0"/>
+          <w:i w:val="0"/>
+          <w:color w:val="57534E"/>
+          <w:sz w:val="14"/>
+        </w:rPr>
+        <w:t>Priced to win in-market: at or below Foundant GLM ($6.5k/$9.9k/$13.9k) and near Plinth (£2.5k/£7.5k/£15k), undercutting on the low-to-mid bands where local funds sit — and never a % of grants.</w:t>
+      </w:r>
+    </w:p>
+    <w:p>
+      <w:pPr>
         <w:spacing w:before="80" w:after="20" w:line="240" w:lineRule="auto"/>
       </w:pPr>
       <w:r>
@@ -1869,6 +1884,21 @@
     </w:tbl>
     <w:p>
       <w:pPr>
+        <w:spacing w:after="40" w:line="240" w:lineRule="auto"/>
+      </w:pPr>
+      <w:r>
+        <w:rPr>
+          <w:rFonts w:ascii="Georgia" w:hAnsi="Georgia"/>
+          <w:b w:val="0"/>
+          <w:i w:val="0"/>
+          <w:color w:val="57534E"/>
+          <w:sz w:val="14"/>
+        </w:rPr>
+        <w:t>Priced to win in-market: less than Sage Intacct alone ($15k–$50k/yr + $30k–$75k setup; NetSuite 1.5–2.5×) — for finance, HR, procurement, M&amp;E and governance combined, and under ~2% of budget.</w:t>
+      </w:r>
+    </w:p>
+    <w:p>
+      <w:pPr>
         <w:spacing w:before="80" w:after="20" w:line="240" w:lineRule="auto"/>
       </w:pPr>
       <w:r>
@@ -2351,7 +2381,7 @@
           <w:color w:val="57534E"/>
           <w:sz w:val="14"/>
         </w:rPr>
-        <w:t>Build feeds Trust and Fund, so any org on Build carries a self-updating passport — the Trust Rating rides along free. Donor-sponsored variants (Motion G) sit above the direct price.</w:t>
+        <w:t>Build feeds Trust and Fund, so any org on Build carries a live Trust Rating free; donor-sponsored (Motion G) sits above direct.</w:t>
       </w:r>
     </w:p>
     <w:p>
@@ -2365,7 +2395,7 @@
           <w:color w:val="1F3864"/>
           <w:sz w:val="19"/>
         </w:rPr>
-        <w:t>The rules (non-negotiable)</w:t>
+        <w:t>Pricing principles (non-negotiable)</w:t>
       </w:r>
     </w:p>
     <w:p>
@@ -2379,7 +2409,21 @@
           <w:color w:val="1A1410"/>
           <w:sz w:val="16"/>
         </w:rPr>
-        <w:t>NGOs never pay to apply, report, or hold a core passport — the funder pays. No % of disbursements.</w:t>
+        <w:t>NGOs are never charged — applicants and grantees apply, report and hold a core Trust Passport for free, always; the funder or sponsor who holds the budget pays. Never a % of disbursements.</w:t>
+      </w:r>
+    </w:p>
+    <w:p>
+      <w:pPr>
+        <w:pStyle w:val="ListBullet"/>
+        <w:spacing w:after="20" w:line="240" w:lineRule="auto"/>
+      </w:pPr>
+      <w:r>
+        <w:rPr>
+          <w:rFonts w:ascii="Georgia" w:hAnsi="Georgia"/>
+          <w:color w:val="1A1410"/>
+          <w:sz w:val="16"/>
+        </w:rPr>
+        <w:t>Price on value, not seats: grant volume, orgs relied on, or org size selects the flat tier — users are unlimited.</w:t>
       </w:r>
     </w:p>
     <w:p>
@@ -2435,7 +2479,7 @@
           <w:color w:val="1A1410"/>
           <w:sz w:val="16"/>
         </w:rPr>
-        <w:t>No free live-production pilots — paid pilots only, fully credited to Year 1 on timely conversion.</w:t>
+        <w:t>Paid pilots only — no free live-production deployments; fully credited to Year 1 on timely conversion.</w:t>
       </w:r>
     </w:p>
     <w:p>
@@ -2520,7 +2564,7 @@
           <w:color w:val="57534E"/>
           <w:sz w:val="14"/>
         </w:rPr>
-        <w:t>Anchored to Plinth (£2.5k/£7.5k/£15k), Foundant GLM ($6.5k/$9.9k/$13.9k), NGOsource (donor-paid reuse), OpenSanctions (~€0.10/query). Figures are recommendations to test, not proof of willingness to pay.</w:t>
+        <w:t>All figures are recommendations to validate in paid pilots — not a public rate card, and not proof of willingness to pay. Competitor prices observed from public sources on 9 August 2026.</w:t>
       </w:r>
     </w:p>
     <w:sectPr>

</xml_diff>